<commit_message>
Ready for time created fix
</commit_message>
<xml_diff>
--- a/MTG_Unused_Mechanics_Effect_Reference.docx
+++ b/MTG_Unused_Mechanics_Effect_Reference.docx
@@ -169,27 +169,6 @@
       <w:r>
         <w:rPr/>
         <w:t>Pay the awaken cost to cast the spell and also put the stated number of +1/+1 counters on a land you control; it becomes a 0/0 Elemental creature with haste in addition to being a land.</w:t>
-      </w:r>
-    </w:p>
-    <w:p>
-      <w:pPr>
-        <w:pStyle w:val="EntryName"/>
-        <w:keepNext w:val="true"/>
-        <w:rPr/>
-      </w:pPr>
-      <w:r>
-        <w:rPr/>
-        <w:t>Banding</w:t>
-      </w:r>
-    </w:p>
-    <w:p>
-      <w:pPr>
-        <w:pStyle w:val="EntryEffect"/>
-        <w:rPr/>
-      </w:pPr>
-      <w:r>
-        <w:rPr/>
-        <w:t>Creatures can attack together in bands; the band can be blocked as a unit, and a player controlling a creature with banding assigns combat damage from creatures blocking or blocked by it rather than their controller doing so.</w:t>
       </w:r>
     </w:p>
     <w:p>

</xml_diff>